<commit_message>
Nuevo nombre del proyecto: Forever Ink (código, pruebas, documentos y compilado)
Co-Authored-By: Claude Sonnet 5.5 <noreply@anthropic.com>
Claude-Session: https://claude.ai/code/session_01LaPXtaCfna2Tf3AsQieRe8
</commit_message>
<xml_diff>
--- a/docs/Guia_Defensa_Presentacion.docx
+++ b/docs/Guia_Defensa_Presentacion.docx
@@ -57,7 +57,7 @@
           <w:sz w:val="28"/>
           <w:szCs w:val="28"/>
         </w:rPr>
-        <w:t xml:space="preserve">Proyecto Trazo Fino · Evaluación Parcial 2</w:t>
+        <w:t xml:space="preserve">Proyecto Forever Ink · Evaluación Parcial 2</w:t>
       </w:r>
     </w:p>
     <w:p>
@@ -874,7 +874,7 @@
           <w:i/>
           <w:iCs/>
         </w:rPr>
-        <w:t xml:space="preserve">“Trazo Fino es la tienda de un estudio de tatuajes. Cada producto es un diseño de tatuaje, el stock son los cupos y el carrito es la reserva: el cliente elige diseños, agenda una cita con un tatuador en un día y horario disponible, y paga con una pasarela simulada. El personal usa un panel para administrar órdenes, diseños, categorías y usuarios. Lo construimos con React y Vite, el diseño responsivo es de Bootstrap, y como no hay backend usamos un archivo JavaScript que simula la base de datos con CRUD sobre localStorage. Probamos la lógica y los componentes con Jasmine y Karma: tenemos 132 pruebas y una cobertura de 90,0 % de las sentencias.”</w:t>
+        <w:t xml:space="preserve">“Forever Ink es la tienda de un estudio de tatuajes. Cada producto es un diseño de tatuaje, el stock son los cupos y el carrito es la reserva: el cliente elige diseños, agenda una cita con un tatuador en un día y horario disponible, y paga con una pasarela simulada. El personal usa un panel para administrar órdenes, diseños, categorías y usuarios. Lo construimos con React y Vite, el diseño responsivo es de Bootstrap, y como no hay backend usamos un archivo JavaScript que simula la base de datos con CRUD sobre localStorage. Probamos la lógica y los componentes con Jasmine y Karma: tenemos 132 pruebas y una cobertura de 90,0 % de las sentencias.”</w:t>
       </w:r>
     </w:p>
     <w:p>
@@ -1104,7 +1104,7 @@
                 <w:sz w:val="19"/>
                 <w:szCs w:val="19"/>
               </w:rPr>
-              <w:t xml:space="preserve">Administrador: admin.trazofino@gmail.com / Admin#123 · Vendedor: vendedor.trazofino@gmail.com / Venta#123 · Cliente: cliente.demo@gmail.com / Cliente#1</w:t>
+              <w:t xml:space="preserve">Administrador: admin.foreverink@gmail.com / Admin#123 · Vendedor: vendedor.foreverink@gmail.com / Venta#123 · Cliente: cliente.demo@gmail.com / Cliente#1</w:t>
             </w:r>
           </w:p>
         </w:tc>
@@ -14311,7 +14311,7 @@
         <w:sz w:val="16"/>
         <w:szCs w:val="16"/>
       </w:rPr>
-      <w:t xml:space="preserve">Trazo Fino · Guía para defender la presentación</w:t>
+      <w:t xml:space="preserve">Forever Ink · Guía para defender la presentación</w:t>
     </w:r>
   </w:p>
 </w:hdr>

</xml_diff>

<commit_message>
Header y Footer con los nombres de la diapositiva React III (antes BarraNavegacion y PieDePagina)
Co-Authored-By: Claude Opus 5.5 <noreply@anthropic.com>
Claude-Session: https://claude.ai/code/session_01Pt6gjuLf4CGXtN9zPMw67H
</commit_message>
<xml_diff>
--- a/docs/Guia_Defensa_Presentacion.docx
+++ b/docs/Guia_Defensa_Presentacion.docx
@@ -2346,7 +2346,7 @@
                 <w:sz w:val="18"/>
                 <w:szCs w:val="18"/>
               </w:rPr>
-              <w:t xml:space="preserve">BarraNavegacion, PieDePagina, ListaProductos, FormularioCheckout, FormularioUsuario, Boleta</w:t>
+              <w:t>Header, Footer, ListaProductos, FormularioCheckout, FormularioUsuario, Boleta</w:t>
             </w:r>
           </w:p>
         </w:tc>
@@ -4007,7 +4007,7 @@
                 <w:sz w:val="18"/>
                 <w:szCs w:val="18"/>
               </w:rPr>
-              <w:t xml:space="preserve">BarraNavegacion.jsx</w:t>
+              <w:t>Header.jsx</w:t>
             </w:r>
           </w:p>
         </w:tc>
@@ -4849,7 +4849,7 @@
                 <w:sz w:val="18"/>
                 <w:szCs w:val="18"/>
               </w:rPr>
-              <w:t xml:space="preserve">En el estado de App.jsx (useState). App le pasa total y cantidad a LayoutTienda, y esta a BarraNavegacion, por props. Al agregar un diseño, App cambia su estado y React redibuja la barra.</w:t>
+              <w:t>En el estado de App.jsx (useState). App le pasa total y cantidad a LayoutTienda, y esta a Header, por props. Al agregar un diseño, App cambia su estado y React redibuja la barra.</w:t>
             </w:r>
           </w:p>
         </w:tc>

</xml_diff>

<commit_message>
Backend: migraciones con Flyway y pruebas unitarias JUnit 5 + Mockito
- Los scripts SQL pasan a src/main/resources/db/migration (V1__init.sql,
  V2__datos_iniciales.sql) y los ejecuta Flyway, como en la guía 2.2.1.
- Pruebas unitarias sin base de datos: ProductoServiceTest, ValidarRunTest,
  RolUtilTest y CarritoServiceTest (repositorios y Feign simulados con Mockito).
- README del backend, ERS y guía de defensa actualizados.

Co-Authored-By: Claude Opus 5.5 <noreply@anthropic.com>
Claude-Session: https://claude.ai/code/session_01Pt6gjuLf4CGXtN9zPMw67H
</commit_message>
<xml_diff>
--- a/docs/Guia_Defensa_Presentacion.docx
+++ b/docs/Guia_Defensa_Presentacion.docx
@@ -4651,7 +4651,80 @@
         <w:rPr>
           <w:rFonts w:ascii="Arial" w:cs="Arial" w:eastAsia="Arial" w:hAnsi="Arial"/>
         </w:rPr>
-        <w:t xml:space="preserve">Las tablas no las crea Hibernate: vienen de los scripts V1__estructura.sql y V2__datos_iniciales.sql, y cada servicio tiene su propia base (guía 2.2.1).</w:t>
+        <w:t xml:space="preserve">Las tablas no las crea Hibernate: las crea </w:t>
+      </w:r>
+      <w:r>
+        <w:rPr>
+          <w:rFonts w:ascii="Arial" w:cs="Arial" w:eastAsia="Arial" w:hAnsi="Arial"/>
+          <w:b/>
+          <w:bCs/>
+        </w:rPr>
+        <w:t xml:space="preserve">Flyway</w:t>
+      </w:r>
+      <w:r>
+        <w:rPr>
+          <w:rFonts w:ascii="Arial" w:cs="Arial" w:eastAsia="Arial" w:hAnsi="Arial"/>
+        </w:rPr>
+        <w:t xml:space="preserve"> con los scripts de db/migration (V1__init.sql y V2__datos_iniciales.sql), que se ejecutan una sola vez y quedan anotados en flyway_schema_history. Cada servicio tiene su propia base (guía 2.2.1).</w:t>
+      </w:r>
+    </w:p>
+    <w:p>
+      <w:pPr>
+        <w:pStyle w:val="ListParagraph"/>
+        <w:numPr>
+          <w:ilvl w:val="0"/>
+          <w:numId w:val="4"/>
+        </w:numPr>
+        <w:spacing w:after="60" w:line="264"/>
+      </w:pPr>
+      <w:r>
+        <w:rPr>
+          <w:rFonts w:ascii="Arial" w:cs="Arial" w:eastAsia="Arial" w:hAnsi="Arial"/>
+        </w:rPr>
+        <w:t xml:space="preserve">Pruebas del backend: cada microservicio tiene pruebas </w:t>
+      </w:r>
+      <w:r>
+        <w:rPr>
+          <w:rFonts w:ascii="Arial" w:cs="Arial" w:eastAsia="Arial" w:hAnsi="Arial"/>
+          <w:b/>
+          <w:bCs/>
+        </w:rPr>
+        <w:t xml:space="preserve">JUnit 5</w:t>
+      </w:r>
+      <w:r>
+        <w:rPr>
+          <w:rFonts w:ascii="Arial" w:cs="Arial" w:eastAsia="Arial" w:hAnsi="Arial"/>
+        </w:rPr>
+        <w:t xml:space="preserve"> con </w:t>
+      </w:r>
+      <w:r>
+        <w:rPr>
+          <w:rFonts w:ascii="Arial" w:cs="Arial" w:eastAsia="Arial" w:hAnsi="Arial"/>
+          <w:b/>
+          <w:bCs/>
+        </w:rPr>
+        <w:t xml:space="preserve">Mockito</w:t>
+      </w:r>
+      <w:r>
+        <w:rPr>
+          <w:rFonts w:ascii="Arial" w:cs="Arial" w:eastAsia="Arial" w:hAnsi="Arial"/>
+        </w:rPr>
+        <w:t xml:space="preserve"> (</w:t>
+      </w:r>
+      <w:r>
+        <w:rPr>
+          <w:rFonts w:ascii="Consolas" w:cs="Consolas" w:eastAsia="Consolas" w:hAnsi="Consolas"/>
+          <w:sz w:val="19"/>
+          <w:szCs w:val="19"/>
+          <w:shd w:fill="F4F4F4" w:color="auto" w:val="clear"/>
+        </w:rPr>
+        <w:t xml:space="preserve">mvn test</w:t>
+      </w:r>
+      <w:r>
+        <w:rPr>
+          <w:rFonts w:ascii="Arial" w:cs="Arial" w:eastAsia="Arial" w:hAnsi="Arial"/>
+        </w:rPr>
+        <w:t xml:space="preserve">), por ejemplo que el carrito no deje reservar más cupos de los que informa producto-service.</w:t>
       </w:r>
     </w:p>
     <w:p>

</xml_diff>

<commit_message>
Backend simplificado al estilo de Music Shop
- Lombok (@Data) en entidades y DTOs; inyección con @Autowired.
- Errores con ResponseStatusException y un solo GlobalExceptionHandler por
  servicio (se mantiene el ErrorDto estándar de la guía 2.3.1).
- usuario-service: un solo UsuarioRequest para registrar y editar; el rol
  se calcula en la entidad Usuario (se elimina RolUtil).
- carrito-service: una sola tabla carrito_items y menos DTOs y endpoints.
- Pruebas JUnit con @Mock / @InjectMocks y orden given/when/then.
- README del backend, colección Postman y guía de defensa actualizados.

Co-Authored-By: Claude Opus 5.5 <noreply@anthropic.com>
Claude-Session: https://claude.ai/code/session_01Pt6gjuLf4CGXtN9zPMw67H
</commit_message>
<xml_diff>
--- a/docs/Guia_Defensa_Presentacion.docx
+++ b/docs/Guia_Defensa_Presentacion.docx
@@ -4741,6 +4741,22 @@
           <w:rFonts w:ascii="Arial" w:cs="Arial" w:eastAsia="Arial" w:hAnsi="Arial"/>
         </w:rPr>
         <w:t xml:space="preserve">Seguridad (guía 2.3.2): API STATELESS con JWT, BCrypt, @PreAuthorize para el rol ADMIN, CORS para el frontend y logs con SLF4J.</w:t>
+      </w:r>
+    </w:p>
+    <w:p>
+      <w:pPr>
+        <w:pStyle w:val="ListParagraph"/>
+        <w:numPr>
+          <w:ilvl w:val="0"/>
+          <w:numId w:val="4"/>
+        </w:numPr>
+        <w:spacing w:after="60" w:line="264"/>
+      </w:pPr>
+      <w:r>
+        <w:rPr>
+          <w:rFonts w:ascii="Arial" w:cs="Arial" w:eastAsia="Arial" w:hAnsi="Arial"/>
+        </w:rPr>
+        <w:t xml:space="preserve">Estilo igual al de Music Shop (Fullstack I): Lombok (@Data) en entidades y DTOs, @Autowired para inyectar, errores con ResponseStatusException que convierte el GlobalExceptionHandler, y carrito-service con una sola tabla (carrito_items).</w:t>
       </w:r>
     </w:p>
     <w:p>

</xml_diff>

<commit_message>
Backend: Maven Wrapper (mvnw) en los 3 microservicios
Permite compilar y levantar cada servicio sin tener Maven instalado,
igual que en Music Shop. README y guía de defensa con los comandos nuevos.

Co-Authored-By: Claude Opus 5.5 <noreply@anthropic.com>
Claude-Session: https://claude.ai/code/session_01Pt6gjuLf4CGXtN9zPMw67H
</commit_message>
<xml_diff>
--- a/docs/Guia_Defensa_Presentacion.docx
+++ b/docs/Guia_Defensa_Presentacion.docx
@@ -1327,7 +1327,7 @@
                 <w:szCs w:val="17"/>
                 <w:shd w:fill="F4F4F4" w:color="auto" w:val="clear"/>
               </w:rPr>
-              <w:t xml:space="preserve">mvn spring-boot:run</w:t>
+              <w:t xml:space="preserve">.\mvnw.cmd spring-boot:run</w:t>
             </w:r>
           </w:p>
         </w:tc>
@@ -2797,7 +2797,7 @@
           <w:szCs w:val="19"/>
           <w:shd w:fill="F4F4F4" w:color="auto" w:val="clear"/>
         </w:rPr>
-        <w:t xml:space="preserve">mvn spring-boot:run</w:t>
+        <w:t xml:space="preserve">.\mvnw.cmd spring-boot:run</w:t>
       </w:r>
       <w:r>
         <w:rPr>
@@ -4718,7 +4718,7 @@
           <w:szCs w:val="19"/>
           <w:shd w:fill="F4F4F4" w:color="auto" w:val="clear"/>
         </w:rPr>
-        <w:t xml:space="preserve">mvn test</w:t>
+        <w:t xml:space="preserve">.\mvnw.cmd test</w:t>
       </w:r>
       <w:r>
         <w:rPr>

</xml_diff>